<commit_message>
Added Relationship and Cardinality of the Databse
</commit_message>
<xml_diff>
--- a/EER Diagram/1) Database Terminology.docx
+++ b/EER Diagram/1) Database Terminology.docx
@@ -896,43 +896,32 @@
     </w:p>
     <w:tbl>
       <w:tblPr>
+        <w:tblStyle w:val="GridTable1Light"/>
         <w:tblW w:w="0" w:type="auto"/>
-        <w:tblCellSpacing w:w="15" w:type="dxa"/>
-        <w:tblCellMar>
-          <w:top w:w="15" w:type="dxa"/>
-          <w:left w:w="15" w:type="dxa"/>
-          <w:bottom w:w="15" w:type="dxa"/>
-          <w:right w:w="15" w:type="dxa"/>
-        </w:tblCellMar>
         <w:tblLook w:val="04A0" w:firstRow="1" w:lastRow="0" w:firstColumn="1" w:lastColumn="0" w:noHBand="0" w:noVBand="1"/>
       </w:tblPr>
       <w:tblGrid>
-        <w:gridCol w:w="1279"/>
-        <w:gridCol w:w="4346"/>
+        <w:gridCol w:w="1420"/>
+        <w:gridCol w:w="4487"/>
       </w:tblGrid>
       <w:tr>
         <w:trPr>
-          <w:tblHeader/>
-          <w:tblCellSpacing w:w="15" w:type="dxa"/>
+          <w:cnfStyle w:val="100000000000" w:firstRow="1" w:lastRow="0" w:firstColumn="0" w:lastColumn="0" w:oddVBand="0" w:evenVBand="0" w:oddHBand="0" w:evenHBand="0" w:firstRowFirstColumn="0" w:firstRowLastColumn="0" w:lastRowFirstColumn="0" w:lastRowLastColumn="0"/>
         </w:trPr>
         <w:tc>
           <w:tcPr>
+            <w:cnfStyle w:val="001000000000" w:firstRow="0" w:lastRow="0" w:firstColumn="1" w:lastColumn="0" w:oddVBand="0" w:evenVBand="0" w:oddHBand="0" w:evenHBand="0" w:firstRowFirstColumn="0" w:firstRowLastColumn="0" w:lastRowFirstColumn="0" w:lastRowLastColumn="0"/>
             <w:tcW w:w="0" w:type="auto"/>
-            <w:vAlign w:val="center"/>
             <w:hideMark/>
           </w:tcPr>
           <w:p>
             <w:pPr>
               <w:rPr>
-                <w:b/>
-                <w:bCs/>
+                <w:b w:val="0"/>
+                <w:bCs w:val="0"/>
               </w:rPr>
             </w:pPr>
             <w:r>
-              <w:rPr>
-                <w:b/>
-                <w:bCs/>
-              </w:rPr>
               <w:t>Cardinality</w:t>
             </w:r>
           </w:p>
@@ -940,34 +929,27 @@
         <w:tc>
           <w:tcPr>
             <w:tcW w:w="0" w:type="auto"/>
-            <w:vAlign w:val="center"/>
             <w:hideMark/>
           </w:tcPr>
           <w:p>
             <w:pPr>
+              <w:cnfStyle w:val="100000000000" w:firstRow="1" w:lastRow="0" w:firstColumn="0" w:lastColumn="0" w:oddVBand="0" w:evenVBand="0" w:oddHBand="0" w:evenHBand="0" w:firstRowFirstColumn="0" w:firstRowLastColumn="0" w:lastRowFirstColumn="0" w:lastRowLastColumn="0"/>
               <w:rPr>
-                <w:b/>
-                <w:bCs/>
+                <w:b w:val="0"/>
+                <w:bCs w:val="0"/>
               </w:rPr>
             </w:pPr>
             <w:r>
-              <w:rPr>
-                <w:b/>
-                <w:bCs/>
-              </w:rPr>
               <w:t>Meaning</w:t>
             </w:r>
           </w:p>
         </w:tc>
       </w:tr>
       <w:tr>
-        <w:trPr>
-          <w:tblCellSpacing w:w="15" w:type="dxa"/>
-        </w:trPr>
         <w:tc>
           <w:tcPr>
+            <w:cnfStyle w:val="001000000000" w:firstRow="0" w:lastRow="0" w:firstColumn="1" w:lastColumn="0" w:oddVBand="0" w:evenVBand="0" w:oddHBand="0" w:evenHBand="0" w:firstRowFirstColumn="0" w:firstRowLastColumn="0" w:lastRowFirstColumn="0" w:lastRowLastColumn="0"/>
             <w:tcW w:w="0" w:type="auto"/>
-            <w:vAlign w:val="center"/>
             <w:hideMark/>
           </w:tcPr>
           <w:p>
@@ -979,10 +961,12 @@
         <w:tc>
           <w:tcPr>
             <w:tcW w:w="0" w:type="auto"/>
-            <w:vAlign w:val="center"/>
             <w:hideMark/>
           </w:tcPr>
           <w:p>
+            <w:pPr>
+              <w:cnfStyle w:val="000000000000" w:firstRow="0" w:lastRow="0" w:firstColumn="0" w:lastColumn="0" w:oddVBand="0" w:evenVBand="0" w:oddHBand="0" w:evenHBand="0" w:firstRowFirstColumn="0" w:firstRowLastColumn="0" w:lastRowFirstColumn="0" w:lastRowLastColumn="0"/>
+            </w:pPr>
             <w:r>
               <w:t>One record is related to one record</w:t>
             </w:r>
@@ -990,13 +974,10 @@
         </w:tc>
       </w:tr>
       <w:tr>
-        <w:trPr>
-          <w:tblCellSpacing w:w="15" w:type="dxa"/>
-        </w:trPr>
         <w:tc>
           <w:tcPr>
+            <w:cnfStyle w:val="001000000000" w:firstRow="0" w:lastRow="0" w:firstColumn="1" w:lastColumn="0" w:oddVBand="0" w:evenVBand="0" w:oddHBand="0" w:evenHBand="0" w:firstRowFirstColumn="0" w:firstRowLastColumn="0" w:lastRowFirstColumn="0" w:lastRowLastColumn="0"/>
             <w:tcW w:w="0" w:type="auto"/>
-            <w:vAlign w:val="center"/>
             <w:hideMark/>
           </w:tcPr>
           <w:p>
@@ -1010,10 +991,12 @@
         <w:tc>
           <w:tcPr>
             <w:tcW w:w="0" w:type="auto"/>
-            <w:vAlign w:val="center"/>
             <w:hideMark/>
           </w:tcPr>
           <w:p>
+            <w:pPr>
+              <w:cnfStyle w:val="000000000000" w:firstRow="0" w:lastRow="0" w:firstColumn="0" w:lastColumn="0" w:oddVBand="0" w:evenVBand="0" w:oddHBand="0" w:evenHBand="0" w:firstRowFirstColumn="0" w:firstRowLastColumn="0" w:lastRowFirstColumn="0" w:lastRowLastColumn="0"/>
+            </w:pPr>
             <w:r>
               <w:t>One record is related to many records</w:t>
             </w:r>
@@ -1021,13 +1004,10 @@
         </w:tc>
       </w:tr>
       <w:tr>
-        <w:trPr>
-          <w:tblCellSpacing w:w="15" w:type="dxa"/>
-        </w:trPr>
         <w:tc>
           <w:tcPr>
+            <w:cnfStyle w:val="001000000000" w:firstRow="0" w:lastRow="0" w:firstColumn="1" w:lastColumn="0" w:oddVBand="0" w:evenVBand="0" w:oddHBand="0" w:evenHBand="0" w:firstRowFirstColumn="0" w:firstRowLastColumn="0" w:lastRowFirstColumn="0" w:lastRowLastColumn="0"/>
             <w:tcW w:w="0" w:type="auto"/>
-            <w:vAlign w:val="center"/>
             <w:hideMark/>
           </w:tcPr>
           <w:p>
@@ -1041,10 +1021,12 @@
         <w:tc>
           <w:tcPr>
             <w:tcW w:w="0" w:type="auto"/>
-            <w:vAlign w:val="center"/>
             <w:hideMark/>
           </w:tcPr>
           <w:p>
+            <w:pPr>
+              <w:cnfStyle w:val="000000000000" w:firstRow="0" w:lastRow="0" w:firstColumn="0" w:lastColumn="0" w:oddVBand="0" w:evenVBand="0" w:oddHBand="0" w:evenHBand="0" w:firstRowFirstColumn="0" w:firstRowLastColumn="0" w:lastRowFirstColumn="0" w:lastRowLastColumn="0"/>
+            </w:pPr>
             <w:r>
               <w:t>Many records are related to many records</w:t>
             </w:r>
@@ -1052,13 +1034,10 @@
         </w:tc>
       </w:tr>
       <w:tr>
-        <w:trPr>
-          <w:tblCellSpacing w:w="15" w:type="dxa"/>
-        </w:trPr>
         <w:tc>
           <w:tcPr>
+            <w:cnfStyle w:val="001000000000" w:firstRow="0" w:lastRow="0" w:firstColumn="1" w:lastColumn="0" w:oddVBand="0" w:evenVBand="0" w:oddHBand="0" w:evenHBand="0" w:firstRowFirstColumn="0" w:firstRowLastColumn="0" w:lastRowFirstColumn="0" w:lastRowLastColumn="0"/>
             <w:tcW w:w="0" w:type="auto"/>
-            <w:vAlign w:val="center"/>
             <w:hideMark/>
           </w:tcPr>
           <w:p>
@@ -1070,10 +1049,12 @@
         <w:tc>
           <w:tcPr>
             <w:tcW w:w="0" w:type="auto"/>
-            <w:vAlign w:val="center"/>
             <w:hideMark/>
           </w:tcPr>
           <w:p>
+            <w:pPr>
+              <w:cnfStyle w:val="000000000000" w:firstRow="0" w:lastRow="0" w:firstColumn="0" w:lastColumn="0" w:oddVBand="0" w:evenVBand="0" w:oddHBand="0" w:evenHBand="0" w:firstRowFirstColumn="0" w:firstRowLastColumn="0" w:lastRowFirstColumn="0" w:lastRowLastColumn="0"/>
+            </w:pPr>
             <w:r>
               <w:t>Zero or one</w:t>
             </w:r>
@@ -1081,13 +1062,10 @@
         </w:tc>
       </w:tr>
       <w:tr>
-        <w:trPr>
-          <w:tblCellSpacing w:w="15" w:type="dxa"/>
-        </w:trPr>
         <w:tc>
           <w:tcPr>
+            <w:cnfStyle w:val="001000000000" w:firstRow="0" w:lastRow="0" w:firstColumn="1" w:lastColumn="0" w:oddVBand="0" w:evenVBand="0" w:oddHBand="0" w:evenHBand="0" w:firstRowFirstColumn="0" w:firstRowLastColumn="0" w:lastRowFirstColumn="0" w:lastRowLastColumn="0"/>
             <w:tcW w:w="0" w:type="auto"/>
-            <w:vAlign w:val="center"/>
             <w:hideMark/>
           </w:tcPr>
           <w:p>
@@ -1099,10 +1077,12 @@
         <w:tc>
           <w:tcPr>
             <w:tcW w:w="0" w:type="auto"/>
-            <w:vAlign w:val="center"/>
             <w:hideMark/>
           </w:tcPr>
           <w:p>
+            <w:pPr>
+              <w:cnfStyle w:val="000000000000" w:firstRow="0" w:lastRow="0" w:firstColumn="0" w:lastColumn="0" w:oddVBand="0" w:evenVBand="0" w:oddHBand="0" w:evenHBand="0" w:firstRowFirstColumn="0" w:firstRowLastColumn="0" w:lastRowFirstColumn="0" w:lastRowLastColumn="0"/>
+            </w:pPr>
             <w:r>
               <w:t>Exactly one</w:t>
             </w:r>
@@ -1110,13 +1090,10 @@
         </w:tc>
       </w:tr>
       <w:tr>
-        <w:trPr>
-          <w:tblCellSpacing w:w="15" w:type="dxa"/>
-        </w:trPr>
         <w:tc>
           <w:tcPr>
+            <w:cnfStyle w:val="001000000000" w:firstRow="0" w:lastRow="0" w:firstColumn="1" w:lastColumn="0" w:oddVBand="0" w:evenVBand="0" w:oddHBand="0" w:evenHBand="0" w:firstRowFirstColumn="0" w:firstRowLastColumn="0" w:lastRowFirstColumn="0" w:lastRowLastColumn="0"/>
             <w:tcW w:w="0" w:type="auto"/>
-            <w:vAlign w:val="center"/>
             <w:hideMark/>
           </w:tcPr>
           <w:p>
@@ -1130,10 +1107,12 @@
         <w:tc>
           <w:tcPr>
             <w:tcW w:w="0" w:type="auto"/>
-            <w:vAlign w:val="center"/>
             <w:hideMark/>
           </w:tcPr>
           <w:p>
+            <w:pPr>
+              <w:cnfStyle w:val="000000000000" w:firstRow="0" w:lastRow="0" w:firstColumn="0" w:lastColumn="0" w:oddVBand="0" w:evenVBand="0" w:oddHBand="0" w:evenHBand="0" w:firstRowFirstColumn="0" w:firstRowLastColumn="0" w:lastRowFirstColumn="0" w:lastRowLastColumn="0"/>
+            </w:pPr>
             <w:r>
               <w:t>Zero or many</w:t>
             </w:r>
@@ -1141,13 +1120,10 @@
         </w:tc>
       </w:tr>
       <w:tr>
-        <w:trPr>
-          <w:tblCellSpacing w:w="15" w:type="dxa"/>
-        </w:trPr>
         <w:tc>
           <w:tcPr>
+            <w:cnfStyle w:val="001000000000" w:firstRow="0" w:lastRow="0" w:firstColumn="1" w:lastColumn="0" w:oddVBand="0" w:evenVBand="0" w:oddHBand="0" w:evenHBand="0" w:firstRowFirstColumn="0" w:firstRowLastColumn="0" w:lastRowFirstColumn="0" w:lastRowLastColumn="0"/>
             <w:tcW w:w="0" w:type="auto"/>
-            <w:vAlign w:val="center"/>
             <w:hideMark/>
           </w:tcPr>
           <w:p>
@@ -1161,10 +1137,12 @@
         <w:tc>
           <w:tcPr>
             <w:tcW w:w="0" w:type="auto"/>
-            <w:vAlign w:val="center"/>
             <w:hideMark/>
           </w:tcPr>
           <w:p>
+            <w:pPr>
+              <w:cnfStyle w:val="000000000000" w:firstRow="0" w:lastRow="0" w:firstColumn="0" w:lastColumn="0" w:oddVBand="0" w:evenVBand="0" w:oddHBand="0" w:evenHBand="0" w:firstRowFirstColumn="0" w:firstRowLastColumn="0" w:lastRowFirstColumn="0" w:lastRowLastColumn="0"/>
+            </w:pPr>
             <w:r>
               <w:t>One or many</w:t>
             </w:r>
@@ -3073,6 +3051,7 @@
   <w:style w:type="character" w:default="1" w:styleId="DefaultParagraphFont">
     <w:name w:val="Default Paragraph Font"/>
     <w:uiPriority w:val="1"/>
+    <w:semiHidden/>
     <w:unhideWhenUsed/>
   </w:style>
   <w:style w:type="table" w:default="1" w:styleId="TableNormal">
@@ -3386,6 +3365,63 @@
       <w:spacing w:val="5"/>
     </w:rPr>
   </w:style>
+  <w:style w:type="table" w:styleId="GridTable1Light">
+    <w:name w:val="Grid Table 1 Light"/>
+    <w:basedOn w:val="TableNormal"/>
+    <w:uiPriority w:val="46"/>
+    <w:rsid w:val="001665CE"/>
+    <w:pPr>
+      <w:spacing w:after="0" w:line="240" w:lineRule="auto"/>
+    </w:pPr>
+    <w:tblPr>
+      <w:tblStyleRowBandSize w:val="1"/>
+      <w:tblStyleColBandSize w:val="1"/>
+      <w:tblBorders>
+        <w:top w:val="single" w:sz="4" w:space="0" w:color="999999" w:themeColor="text1" w:themeTint="66"/>
+        <w:left w:val="single" w:sz="4" w:space="0" w:color="999999" w:themeColor="text1" w:themeTint="66"/>
+        <w:bottom w:val="single" w:sz="4" w:space="0" w:color="999999" w:themeColor="text1" w:themeTint="66"/>
+        <w:right w:val="single" w:sz="4" w:space="0" w:color="999999" w:themeColor="text1" w:themeTint="66"/>
+        <w:insideH w:val="single" w:sz="4" w:space="0" w:color="999999" w:themeColor="text1" w:themeTint="66"/>
+        <w:insideV w:val="single" w:sz="4" w:space="0" w:color="999999" w:themeColor="text1" w:themeTint="66"/>
+      </w:tblBorders>
+    </w:tblPr>
+    <w:tblStylePr w:type="firstRow">
+      <w:rPr>
+        <w:b/>
+        <w:bCs/>
+      </w:rPr>
+      <w:tblPr/>
+      <w:tcPr>
+        <w:tcBorders>
+          <w:bottom w:val="single" w:sz="12" w:space="0" w:color="666666" w:themeColor="text1" w:themeTint="99"/>
+        </w:tcBorders>
+      </w:tcPr>
+    </w:tblStylePr>
+    <w:tblStylePr w:type="lastRow">
+      <w:rPr>
+        <w:b/>
+        <w:bCs/>
+      </w:rPr>
+      <w:tblPr/>
+      <w:tcPr>
+        <w:tcBorders>
+          <w:top w:val="double" w:sz="2" w:space="0" w:color="666666" w:themeColor="text1" w:themeTint="99"/>
+        </w:tcBorders>
+      </w:tcPr>
+    </w:tblStylePr>
+    <w:tblStylePr w:type="firstCol">
+      <w:rPr>
+        <w:b/>
+        <w:bCs/>
+      </w:rPr>
+    </w:tblStylePr>
+    <w:tblStylePr w:type="lastCol">
+      <w:rPr>
+        <w:b/>
+        <w:bCs/>
+      </w:rPr>
+    </w:tblStylePr>
+  </w:style>
 </w:styles>
 </file>
 

</xml_diff>